<commit_message>
Remove temporary and test files, update password hashing rounds for improved security, and adjust password hash preview in dashboard.
</commit_message>
<xml_diff>
--- a/Bao_cao_Khao_sat_nghiep_vu_va_bao_ve_mat_khau.docx
+++ b/Bao_cao_Khao_sat_nghiep_vu_va_bao_ve_mat_khau.docx
@@ -15,8 +15,6 @@
       <w:pPr>
         <w:pStyle w:val="2"/>
       </w:pPr>
-      <w:bookmarkStart w:id="0" w:name="_GoBack"/>
-      <w:bookmarkEnd w:id="0"/>
       <w:r>
         <w:t>1. Khảo sát nghiệp vụ và mô hình hóa nghiệp vụ</w:t>
       </w:r>
@@ -81,6 +79,8 @@
         </w:rPr>
         <w:t>Việc nghiên cứu Bcrypt, Scrypt, Argon2 gắn trực tiếp với bước “băm / dẫn xuất khóa từ mật khẩu” trong luồng trên: quyết định độ khó cho kẻ tấn công offline và chi phí tài nguyên khi người dùng hợp lệ đăng nhập.</w:t>
       </w:r>
+      <w:bookmarkStart w:id="0" w:name="_GoBack"/>
+      <w:bookmarkEnd w:id="0"/>
     </w:p>
     <w:p>
       <w:pPr>
@@ -15852,7 +15852,7 @@
 </file>
 
 <file path=customXml/item1.xml><?xml version="1.0" encoding="utf-8"?>
-<b:Sources xmlns:b="http://schemas.openxmlformats.org/officeDocument/2006/bibliography" xmlns="http://schemas.openxmlformats.org/officeDocument/2006/bibliography" StyleName="APA" SelectedStyle="/APA.XSL"/>
+<b:Sources xmlns:b="http://schemas.openxmlformats.org/officeDocument/2006/bibliography" xmlns="http://schemas.openxmlformats.org/officeDocument/2006/bibliography" SelectedStyle="/APA.XSL" StyleName="APA"/>
 </file>
 
 <file path=customXml/itemProps1.xml><?xml version="1.0" encoding="utf-8"?>

</xml_diff>